<commit_message>
feat: nuevos módulos repo.js y vectores.js + cambios
</commit_message>
<xml_diff>
--- a/Documentation_a_instalar/herramientas a instalar.docx
+++ b/Documentation_a_instalar/herramientas a instalar.docx
@@ -13,6 +13,7 @@
           <w:u w:val="single"/>
         </w:rPr>
       </w:pPr>
+      <w:proofErr w:type="spellStart"/>
       <w:r>
         <w:rPr>
           <w:b/>
@@ -33,6 +34,7 @@
         </w:rPr>
         <w:t>epomix</w:t>
       </w:r>
+      <w:proofErr w:type="spellEnd"/>
       <w:r>
         <w:rPr>
           <w:b/>
@@ -51,7 +53,51 @@
           <w:sz w:val="32"/>
           <w:szCs w:val="32"/>
         </w:rPr>
-        <w:t>en resumen este paquete lo que hace es empaquetar todo el code repositorio (ósea la carpeta del programa) en un solo archivo con las explicaciones para pasarcelo al LLM</w:t>
+        <w:t xml:space="preserve">en resumen este paquete lo que hace es empaquetar todo el </w:t>
+      </w:r>
+      <w:proofErr w:type="spellStart"/>
+      <w:r>
+        <w:rPr>
+          <w:b/>
+          <w:bCs/>
+          <w:color w:val="000000" w:themeColor="text1"/>
+          <w:sz w:val="32"/>
+          <w:szCs w:val="32"/>
+        </w:rPr>
+        <w:t>code</w:t>
+      </w:r>
+      <w:proofErr w:type="spellEnd"/>
+      <w:r>
+        <w:rPr>
+          <w:b/>
+          <w:bCs/>
+          <w:color w:val="000000" w:themeColor="text1"/>
+          <w:sz w:val="32"/>
+          <w:szCs w:val="32"/>
+        </w:rPr>
+        <w:t xml:space="preserve"> repositorio (ósea la carpeta del programa) en un solo archivo con las explicaciones para </w:t>
+      </w:r>
+      <w:proofErr w:type="spellStart"/>
+      <w:r>
+        <w:rPr>
+          <w:b/>
+          <w:bCs/>
+          <w:color w:val="000000" w:themeColor="text1"/>
+          <w:sz w:val="32"/>
+          <w:szCs w:val="32"/>
+        </w:rPr>
+        <w:t>pasarcelo</w:t>
+      </w:r>
+      <w:proofErr w:type="spellEnd"/>
+      <w:r>
+        <w:rPr>
+          <w:b/>
+          <w:bCs/>
+          <w:color w:val="000000" w:themeColor="text1"/>
+          <w:sz w:val="32"/>
+          <w:szCs w:val="32"/>
+        </w:rPr>
+        <w:t xml:space="preserve"> al LLM</w:t>
       </w:r>
     </w:p>
     <w:p>
@@ -85,7 +131,151 @@
           <w:szCs w:val="32"/>
           <w:u w:val="single"/>
         </w:rPr>
-        <w:t>Instala repomix con npm install -g repomix (requiere Node.js), y para probarla con tus 4 archivos (desde la carpeta que los contiene), ejecuta repomix archivo1.js archivo2.js archivo3.js archivo4.js --output resumen.txt — luego puedes cargar resumen.txt directamente en Ollama, completamente offline.</w:t>
+        <w:t xml:space="preserve">Instala </w:t>
+      </w:r>
+      <w:proofErr w:type="spellStart"/>
+      <w:r>
+        <w:rPr>
+          <w:b/>
+          <w:bCs/>
+          <w:color w:val="000000" w:themeColor="text1"/>
+          <w:sz w:val="32"/>
+          <w:szCs w:val="32"/>
+          <w:u w:val="single"/>
+        </w:rPr>
+        <w:t>repomix</w:t>
+      </w:r>
+      <w:proofErr w:type="spellEnd"/>
+      <w:r>
+        <w:rPr>
+          <w:b/>
+          <w:bCs/>
+          <w:color w:val="000000" w:themeColor="text1"/>
+          <w:sz w:val="32"/>
+          <w:szCs w:val="32"/>
+          <w:u w:val="single"/>
+        </w:rPr>
+        <w:t xml:space="preserve"> con </w:t>
+      </w:r>
+      <w:proofErr w:type="spellStart"/>
+      <w:r>
+        <w:rPr>
+          <w:b/>
+          <w:bCs/>
+          <w:color w:val="000000" w:themeColor="text1"/>
+          <w:sz w:val="32"/>
+          <w:szCs w:val="32"/>
+          <w:u w:val="single"/>
+        </w:rPr>
+        <w:t>npm</w:t>
+      </w:r>
+      <w:proofErr w:type="spellEnd"/>
+      <w:r>
+        <w:rPr>
+          <w:b/>
+          <w:bCs/>
+          <w:color w:val="000000" w:themeColor="text1"/>
+          <w:sz w:val="32"/>
+          <w:szCs w:val="32"/>
+          <w:u w:val="single"/>
+        </w:rPr>
+        <w:t xml:space="preserve"> </w:t>
+      </w:r>
+      <w:proofErr w:type="spellStart"/>
+      <w:r>
+        <w:rPr>
+          <w:b/>
+          <w:bCs/>
+          <w:color w:val="000000" w:themeColor="text1"/>
+          <w:sz w:val="32"/>
+          <w:szCs w:val="32"/>
+          <w:u w:val="single"/>
+        </w:rPr>
+        <w:t>install</w:t>
+      </w:r>
+      <w:proofErr w:type="spellEnd"/>
+      <w:r>
+        <w:rPr>
+          <w:b/>
+          <w:bCs/>
+          <w:color w:val="000000" w:themeColor="text1"/>
+          <w:sz w:val="32"/>
+          <w:szCs w:val="32"/>
+          <w:u w:val="single"/>
+        </w:rPr>
+        <w:t xml:space="preserve"> -g </w:t>
+      </w:r>
+      <w:proofErr w:type="spellStart"/>
+      <w:r>
+        <w:rPr>
+          <w:b/>
+          <w:bCs/>
+          <w:color w:val="000000" w:themeColor="text1"/>
+          <w:sz w:val="32"/>
+          <w:szCs w:val="32"/>
+          <w:u w:val="single"/>
+        </w:rPr>
+        <w:t>repomix</w:t>
+      </w:r>
+      <w:proofErr w:type="spellEnd"/>
+      <w:r>
+        <w:rPr>
+          <w:b/>
+          <w:bCs/>
+          <w:color w:val="000000" w:themeColor="text1"/>
+          <w:sz w:val="32"/>
+          <w:szCs w:val="32"/>
+          <w:u w:val="single"/>
+        </w:rPr>
+        <w:t xml:space="preserve"> (requiere Node.js), y para probarla con tus 4 archivos (desde la carpeta que los contiene), ejecuta </w:t>
+      </w:r>
+      <w:proofErr w:type="spellStart"/>
+      <w:r>
+        <w:rPr>
+          <w:b/>
+          <w:bCs/>
+          <w:color w:val="000000" w:themeColor="text1"/>
+          <w:sz w:val="32"/>
+          <w:szCs w:val="32"/>
+          <w:u w:val="single"/>
+        </w:rPr>
+        <w:t>repomix</w:t>
+      </w:r>
+      <w:proofErr w:type="spellEnd"/>
+      <w:r>
+        <w:rPr>
+          <w:b/>
+          <w:bCs/>
+          <w:color w:val="000000" w:themeColor="text1"/>
+          <w:sz w:val="32"/>
+          <w:szCs w:val="32"/>
+          <w:u w:val="single"/>
+        </w:rPr>
+        <w:t xml:space="preserve"> archivo1.js archivo2.js archivo3.js archivo4.js --output resumen.txt — luego puedes cargar resumen.txt directamente en </w:t>
+      </w:r>
+      <w:proofErr w:type="spellStart"/>
+      <w:r>
+        <w:rPr>
+          <w:b/>
+          <w:bCs/>
+          <w:color w:val="000000" w:themeColor="text1"/>
+          <w:sz w:val="32"/>
+          <w:szCs w:val="32"/>
+          <w:u w:val="single"/>
+        </w:rPr>
+        <w:t>Ollama</w:t>
+      </w:r>
+      <w:proofErr w:type="spellEnd"/>
+      <w:r>
+        <w:rPr>
+          <w:b/>
+          <w:bCs/>
+          <w:color w:val="000000" w:themeColor="text1"/>
+          <w:sz w:val="32"/>
+          <w:szCs w:val="32"/>
+          <w:u w:val="single"/>
+        </w:rPr>
+        <w:t>, completamente offline.</w:t>
       </w:r>
       <w:r>
         <w:rPr>
@@ -154,39 +344,124 @@
           <w:u w:val="single"/>
         </w:rPr>
       </w:pPr>
-      <w:r>
-        <w:rPr>
-          <w:b/>
-          <w:bCs/>
-          <w:color w:val="000000" w:themeColor="text1"/>
-          <w:sz w:val="32"/>
-          <w:szCs w:val="32"/>
-          <w:u w:val="single"/>
-        </w:rPr>
-        <w:t>Runtime / motor LLM</w:t>
-      </w:r>
-    </w:p>
-    <w:p>
-      <w:pPr>
-        <w:rPr>
-          <w:b/>
-          <w:bCs/>
-          <w:color w:val="000000" w:themeColor="text1"/>
-          <w:sz w:val="32"/>
-          <w:szCs w:val="32"/>
-          <w:u w:val="single"/>
-        </w:rPr>
-      </w:pPr>
-      <w:r>
-        <w:rPr>
-          <w:b/>
-          <w:bCs/>
-          <w:color w:val="000000" w:themeColor="text1"/>
-          <w:sz w:val="32"/>
-          <w:szCs w:val="32"/>
-          <w:u w:val="single"/>
-        </w:rPr>
-        <w:t>- Ollama (ya instalado) — ollama npm.</w:t>
+      <w:proofErr w:type="spellStart"/>
+      <w:r>
+        <w:rPr>
+          <w:b/>
+          <w:bCs/>
+          <w:color w:val="000000" w:themeColor="text1"/>
+          <w:sz w:val="32"/>
+          <w:szCs w:val="32"/>
+          <w:u w:val="single"/>
+        </w:rPr>
+        <w:t>Runtime</w:t>
+      </w:r>
+      <w:proofErr w:type="spellEnd"/>
+      <w:r>
+        <w:rPr>
+          <w:b/>
+          <w:bCs/>
+          <w:color w:val="000000" w:themeColor="text1"/>
+          <w:sz w:val="32"/>
+          <w:szCs w:val="32"/>
+          <w:u w:val="single"/>
+        </w:rPr>
+        <w:t xml:space="preserve"> / motor LLM</w:t>
+      </w:r>
+    </w:p>
+    <w:p>
+      <w:pPr>
+        <w:rPr>
+          <w:b/>
+          <w:bCs/>
+          <w:color w:val="000000" w:themeColor="text1"/>
+          <w:sz w:val="32"/>
+          <w:szCs w:val="32"/>
+          <w:u w:val="single"/>
+        </w:rPr>
+      </w:pPr>
+      <w:r>
+        <w:rPr>
+          <w:b/>
+          <w:bCs/>
+          <w:color w:val="000000" w:themeColor="text1"/>
+          <w:sz w:val="32"/>
+          <w:szCs w:val="32"/>
+          <w:u w:val="single"/>
+        </w:rPr>
+        <w:t xml:space="preserve">- </w:t>
+      </w:r>
+      <w:proofErr w:type="spellStart"/>
+      <w:r>
+        <w:rPr>
+          <w:b/>
+          <w:bCs/>
+          <w:color w:val="000000" w:themeColor="text1"/>
+          <w:sz w:val="32"/>
+          <w:szCs w:val="32"/>
+          <w:u w:val="single"/>
+        </w:rPr>
+        <w:t>Ollama</w:t>
+      </w:r>
+      <w:proofErr w:type="spellEnd"/>
+      <w:r>
+        <w:rPr>
+          <w:b/>
+          <w:bCs/>
+          <w:color w:val="000000" w:themeColor="text1"/>
+          <w:sz w:val="32"/>
+          <w:szCs w:val="32"/>
+          <w:u w:val="single"/>
+        </w:rPr>
+        <w:t xml:space="preserve"> (ya instalado) — </w:t>
+      </w:r>
+      <w:proofErr w:type="spellStart"/>
+      <w:r>
+        <w:rPr>
+          <w:b/>
+          <w:bCs/>
+          <w:color w:val="000000" w:themeColor="text1"/>
+          <w:sz w:val="32"/>
+          <w:szCs w:val="32"/>
+          <w:u w:val="single"/>
+        </w:rPr>
+        <w:t>ollama</w:t>
+      </w:r>
+      <w:proofErr w:type="spellEnd"/>
+      <w:r>
+        <w:rPr>
+          <w:b/>
+          <w:bCs/>
+          <w:color w:val="000000" w:themeColor="text1"/>
+          <w:sz w:val="32"/>
+          <w:szCs w:val="32"/>
+          <w:u w:val="single"/>
+        </w:rPr>
+        <w:t xml:space="preserve"> </w:t>
+      </w:r>
+      <w:proofErr w:type="spellStart"/>
+      <w:r>
+        <w:rPr>
+          <w:b/>
+          <w:bCs/>
+          <w:color w:val="000000" w:themeColor="text1"/>
+          <w:sz w:val="32"/>
+          <w:szCs w:val="32"/>
+          <w:u w:val="single"/>
+        </w:rPr>
+        <w:t>npm</w:t>
+      </w:r>
+      <w:proofErr w:type="spellEnd"/>
+      <w:r>
+        <w:rPr>
+          <w:b/>
+          <w:bCs/>
+          <w:color w:val="000000" w:themeColor="text1"/>
+          <w:sz w:val="32"/>
+          <w:szCs w:val="32"/>
+          <w:u w:val="single"/>
+        </w:rPr>
+        <w:t>.</w:t>
       </w:r>
     </w:p>
     <w:p>
@@ -232,20 +507,79 @@
           <w:szCs w:val="32"/>
           <w:u w:val="single"/>
         </w:rPr>
-        <w:t>- Embeddings: nomic-embed-text.</w:t>
-      </w:r>
-    </w:p>
-    <w:p>
-      <w:pPr>
-        <w:rPr>
-          <w:b/>
-          <w:bCs/>
-          <w:color w:val="000000" w:themeColor="text1"/>
-          <w:sz w:val="32"/>
-          <w:szCs w:val="32"/>
-          <w:u w:val="single"/>
-        </w:rPr>
-      </w:pPr>
+        <w:t xml:space="preserve">- </w:t>
+      </w:r>
+      <w:proofErr w:type="spellStart"/>
+      <w:r>
+        <w:rPr>
+          <w:b/>
+          <w:bCs/>
+          <w:color w:val="000000" w:themeColor="text1"/>
+          <w:sz w:val="32"/>
+          <w:szCs w:val="32"/>
+          <w:u w:val="single"/>
+        </w:rPr>
+        <w:t>Embeddings</w:t>
+      </w:r>
+      <w:proofErr w:type="spellEnd"/>
+      <w:r>
+        <w:rPr>
+          <w:b/>
+          <w:bCs/>
+          <w:color w:val="000000" w:themeColor="text1"/>
+          <w:sz w:val="32"/>
+          <w:szCs w:val="32"/>
+          <w:u w:val="single"/>
+        </w:rPr>
+        <w:t xml:space="preserve">: </w:t>
+      </w:r>
+      <w:proofErr w:type="spellStart"/>
+      <w:r>
+        <w:rPr>
+          <w:b/>
+          <w:bCs/>
+          <w:color w:val="000000" w:themeColor="text1"/>
+          <w:sz w:val="32"/>
+          <w:szCs w:val="32"/>
+          <w:u w:val="single"/>
+        </w:rPr>
+        <w:t>nomic-embed-text</w:t>
+      </w:r>
+      <w:proofErr w:type="spellEnd"/>
+      <w:r>
+        <w:rPr>
+          <w:b/>
+          <w:bCs/>
+          <w:color w:val="000000" w:themeColor="text1"/>
+          <w:sz w:val="32"/>
+          <w:szCs w:val="32"/>
+          <w:u w:val="single"/>
+        </w:rPr>
+        <w:t>.</w:t>
+      </w:r>
+    </w:p>
+    <w:p>
+      <w:pPr>
+        <w:rPr>
+          <w:b/>
+          <w:bCs/>
+          <w:color w:val="000000" w:themeColor="text1"/>
+          <w:sz w:val="32"/>
+          <w:szCs w:val="32"/>
+          <w:u w:val="single"/>
+        </w:rPr>
+      </w:pPr>
+      <w:r>
+        <w:rPr>
+          <w:b/>
+          <w:bCs/>
+          <w:color w:val="000000" w:themeColor="text1"/>
+          <w:sz w:val="32"/>
+          <w:szCs w:val="32"/>
+          <w:u w:val="single"/>
+        </w:rPr>
+        <w:t>--------------------------------------------------------------------------</w:t>
+      </w:r>
     </w:p>
     <w:p>
       <w:pPr>
@@ -290,30 +624,150 @@
           <w:szCs w:val="32"/>
           <w:u w:val="single"/>
         </w:rPr>
-        <w:t>- tree-sitter + tree-sitter-&lt;lenguaje&gt; (parser/estructura por lenguaje).</w:t>
-      </w:r>
-    </w:p>
-    <w:p>
-      <w:pPr>
-        <w:rPr>
-          <w:b/>
-          <w:bCs/>
-          <w:color w:val="000000" w:themeColor="text1"/>
-          <w:sz w:val="32"/>
-          <w:szCs w:val="32"/>
-          <w:u w:val="single"/>
-        </w:rPr>
-      </w:pPr>
-      <w:r>
-        <w:rPr>
-          <w:b/>
-          <w:bCs/>
-          <w:color w:val="000000" w:themeColor="text1"/>
-          <w:sz w:val="32"/>
-          <w:szCs w:val="32"/>
-          <w:u w:val="single"/>
-        </w:rPr>
-        <w:t>- @vscode/ripgrep o ripgrep (lectura/búsqueda por chunks).</w:t>
+        <w:t xml:space="preserve">- </w:t>
+      </w:r>
+      <w:proofErr w:type="spellStart"/>
+      <w:r>
+        <w:rPr>
+          <w:b/>
+          <w:bCs/>
+          <w:color w:val="000000" w:themeColor="text1"/>
+          <w:sz w:val="32"/>
+          <w:szCs w:val="32"/>
+          <w:u w:val="single"/>
+        </w:rPr>
+        <w:t>tree-sitter</w:t>
+      </w:r>
+      <w:proofErr w:type="spellEnd"/>
+      <w:r>
+        <w:rPr>
+          <w:b/>
+          <w:bCs/>
+          <w:color w:val="000000" w:themeColor="text1"/>
+          <w:sz w:val="32"/>
+          <w:szCs w:val="32"/>
+          <w:u w:val="single"/>
+        </w:rPr>
+        <w:t xml:space="preserve"> + </w:t>
+      </w:r>
+      <w:proofErr w:type="spellStart"/>
+      <w:r>
+        <w:rPr>
+          <w:b/>
+          <w:bCs/>
+          <w:color w:val="000000" w:themeColor="text1"/>
+          <w:sz w:val="32"/>
+          <w:szCs w:val="32"/>
+          <w:u w:val="single"/>
+        </w:rPr>
+        <w:t>tree-sitter</w:t>
+      </w:r>
+      <w:proofErr w:type="spellEnd"/>
+      <w:r>
+        <w:rPr>
+          <w:b/>
+          <w:bCs/>
+          <w:color w:val="000000" w:themeColor="text1"/>
+          <w:sz w:val="32"/>
+          <w:szCs w:val="32"/>
+          <w:u w:val="single"/>
+        </w:rPr>
+        <w:t>-&lt;lenguaje&gt; (</w:t>
+      </w:r>
+      <w:proofErr w:type="spellStart"/>
+      <w:r>
+        <w:rPr>
+          <w:b/>
+          <w:bCs/>
+          <w:color w:val="000000" w:themeColor="text1"/>
+          <w:sz w:val="32"/>
+          <w:szCs w:val="32"/>
+          <w:u w:val="single"/>
+        </w:rPr>
+        <w:t>parser</w:t>
+      </w:r>
+      <w:proofErr w:type="spellEnd"/>
+      <w:r>
+        <w:rPr>
+          <w:b/>
+          <w:bCs/>
+          <w:color w:val="000000" w:themeColor="text1"/>
+          <w:sz w:val="32"/>
+          <w:szCs w:val="32"/>
+          <w:u w:val="single"/>
+        </w:rPr>
+        <w:t>/estructura por lenguaje).</w:t>
+      </w:r>
+    </w:p>
+    <w:p>
+      <w:pPr>
+        <w:rPr>
+          <w:b/>
+          <w:bCs/>
+          <w:color w:val="000000" w:themeColor="text1"/>
+          <w:sz w:val="32"/>
+          <w:szCs w:val="32"/>
+          <w:u w:val="single"/>
+        </w:rPr>
+      </w:pPr>
+      <w:r>
+        <w:rPr>
+          <w:b/>
+          <w:bCs/>
+          <w:color w:val="000000" w:themeColor="text1"/>
+          <w:sz w:val="32"/>
+          <w:szCs w:val="32"/>
+          <w:u w:val="single"/>
+        </w:rPr>
+        <w:t xml:space="preserve">- @vscode/ripgrep o </w:t>
+      </w:r>
+      <w:proofErr w:type="spellStart"/>
+      <w:r>
+        <w:rPr>
+          <w:b/>
+          <w:bCs/>
+          <w:color w:val="000000" w:themeColor="text1"/>
+          <w:sz w:val="32"/>
+          <w:szCs w:val="32"/>
+          <w:u w:val="single"/>
+        </w:rPr>
+        <w:t>ripgrep</w:t>
+      </w:r>
+      <w:proofErr w:type="spellEnd"/>
+      <w:r>
+        <w:rPr>
+          <w:b/>
+          <w:bCs/>
+          <w:color w:val="000000" w:themeColor="text1"/>
+          <w:sz w:val="32"/>
+          <w:szCs w:val="32"/>
+          <w:u w:val="single"/>
+        </w:rPr>
+        <w:t xml:space="preserve"> (lectura/búsqueda por </w:t>
+      </w:r>
+      <w:proofErr w:type="spellStart"/>
+      <w:r>
+        <w:rPr>
+          <w:b/>
+          <w:bCs/>
+          <w:color w:val="000000" w:themeColor="text1"/>
+          <w:sz w:val="32"/>
+          <w:szCs w:val="32"/>
+          <w:u w:val="single"/>
+        </w:rPr>
+        <w:t>chunks</w:t>
+      </w:r>
+      <w:proofErr w:type="spellEnd"/>
+      <w:r>
+        <w:rPr>
+          <w:b/>
+          <w:bCs/>
+          <w:color w:val="000000" w:themeColor="text1"/>
+          <w:sz w:val="32"/>
+          <w:szCs w:val="32"/>
+          <w:u w:val="single"/>
+        </w:rPr>
+        <w:t>).</w:t>
       </w:r>
     </w:p>
     <w:p>
@@ -337,66 +791,172 @@
           <w:u w:val="single"/>
         </w:rPr>
         <w:lastRenderedPageBreak/>
-        <w:t>- ignore (respetar .gitignore).</w:t>
-      </w:r>
-    </w:p>
-    <w:p>
-      <w:pPr>
-        <w:rPr>
-          <w:b/>
-          <w:bCs/>
-          <w:color w:val="000000" w:themeColor="text1"/>
-          <w:sz w:val="32"/>
-          <w:szCs w:val="32"/>
-          <w:u w:val="single"/>
-        </w:rPr>
-      </w:pPr>
-      <w:r>
-        <w:rPr>
-          <w:b/>
-          <w:bCs/>
-          <w:color w:val="000000" w:themeColor="text1"/>
-          <w:sz w:val="32"/>
-          <w:szCs w:val="32"/>
-          <w:u w:val="single"/>
-        </w:rPr>
-        <w:t>- chokidar (watch: reindexado automático al cambiar archivos).</w:t>
-      </w:r>
-    </w:p>
-    <w:p>
-      <w:pPr>
-        <w:rPr>
-          <w:b/>
-          <w:bCs/>
-          <w:color w:val="000000" w:themeColor="text1"/>
-          <w:sz w:val="32"/>
-          <w:szCs w:val="32"/>
-          <w:u w:val="single"/>
-        </w:rPr>
-      </w:pPr>
-      <w:r>
-        <w:rPr>
-          <w:b/>
-          <w:bCs/>
-          <w:color w:val="000000" w:themeColor="text1"/>
-          <w:sz w:val="32"/>
-          <w:szCs w:val="32"/>
-          <w:u w:val="single"/>
-        </w:rPr>
-        <w:t>- globby (selección de archivos por patrones).</w:t>
-      </w:r>
-    </w:p>
-    <w:p>
-      <w:pPr>
-        <w:rPr>
-          <w:b/>
-          <w:bCs/>
-          <w:color w:val="000000" w:themeColor="text1"/>
-          <w:sz w:val="32"/>
-          <w:szCs w:val="32"/>
-          <w:u w:val="single"/>
-        </w:rPr>
-      </w:pPr>
+        <w:t>- ignore (respetar .</w:t>
+      </w:r>
+      <w:proofErr w:type="spellStart"/>
+      <w:r>
+        <w:rPr>
+          <w:b/>
+          <w:bCs/>
+          <w:color w:val="000000" w:themeColor="text1"/>
+          <w:sz w:val="32"/>
+          <w:szCs w:val="32"/>
+          <w:u w:val="single"/>
+        </w:rPr>
+        <w:t>gitignore</w:t>
+      </w:r>
+      <w:proofErr w:type="spellEnd"/>
+      <w:r>
+        <w:rPr>
+          <w:b/>
+          <w:bCs/>
+          <w:color w:val="000000" w:themeColor="text1"/>
+          <w:sz w:val="32"/>
+          <w:szCs w:val="32"/>
+          <w:u w:val="single"/>
+        </w:rPr>
+        <w:t>).</w:t>
+      </w:r>
+    </w:p>
+    <w:p>
+      <w:pPr>
+        <w:rPr>
+          <w:b/>
+          <w:bCs/>
+          <w:color w:val="000000" w:themeColor="text1"/>
+          <w:sz w:val="32"/>
+          <w:szCs w:val="32"/>
+          <w:u w:val="single"/>
+        </w:rPr>
+      </w:pPr>
+      <w:r>
+        <w:rPr>
+          <w:b/>
+          <w:bCs/>
+          <w:color w:val="000000" w:themeColor="text1"/>
+          <w:sz w:val="32"/>
+          <w:szCs w:val="32"/>
+          <w:u w:val="single"/>
+        </w:rPr>
+        <w:t xml:space="preserve">- </w:t>
+      </w:r>
+      <w:proofErr w:type="spellStart"/>
+      <w:r>
+        <w:rPr>
+          <w:b/>
+          <w:bCs/>
+          <w:color w:val="000000" w:themeColor="text1"/>
+          <w:sz w:val="32"/>
+          <w:szCs w:val="32"/>
+          <w:u w:val="single"/>
+        </w:rPr>
+        <w:t>chokidar</w:t>
+      </w:r>
+      <w:proofErr w:type="spellEnd"/>
+      <w:r>
+        <w:rPr>
+          <w:b/>
+          <w:bCs/>
+          <w:color w:val="000000" w:themeColor="text1"/>
+          <w:sz w:val="32"/>
+          <w:szCs w:val="32"/>
+          <w:u w:val="single"/>
+        </w:rPr>
+        <w:t xml:space="preserve"> (</w:t>
+      </w:r>
+      <w:proofErr w:type="spellStart"/>
+      <w:r>
+        <w:rPr>
+          <w:b/>
+          <w:bCs/>
+          <w:color w:val="000000" w:themeColor="text1"/>
+          <w:sz w:val="32"/>
+          <w:szCs w:val="32"/>
+          <w:u w:val="single"/>
+        </w:rPr>
+        <w:t>watch</w:t>
+      </w:r>
+      <w:proofErr w:type="spellEnd"/>
+      <w:r>
+        <w:rPr>
+          <w:b/>
+          <w:bCs/>
+          <w:color w:val="000000" w:themeColor="text1"/>
+          <w:sz w:val="32"/>
+          <w:szCs w:val="32"/>
+          <w:u w:val="single"/>
+        </w:rPr>
+        <w:t>: reindexado automático al cambiar archivos).</w:t>
+      </w:r>
+    </w:p>
+    <w:p>
+      <w:pPr>
+        <w:rPr>
+          <w:b/>
+          <w:bCs/>
+          <w:color w:val="000000" w:themeColor="text1"/>
+          <w:sz w:val="32"/>
+          <w:szCs w:val="32"/>
+          <w:u w:val="single"/>
+        </w:rPr>
+      </w:pPr>
+      <w:r>
+        <w:rPr>
+          <w:b/>
+          <w:bCs/>
+          <w:color w:val="000000" w:themeColor="text1"/>
+          <w:sz w:val="32"/>
+          <w:szCs w:val="32"/>
+          <w:u w:val="single"/>
+        </w:rPr>
+        <w:t xml:space="preserve">- </w:t>
+      </w:r>
+      <w:proofErr w:type="spellStart"/>
+      <w:r>
+        <w:rPr>
+          <w:b/>
+          <w:bCs/>
+          <w:color w:val="000000" w:themeColor="text1"/>
+          <w:sz w:val="32"/>
+          <w:szCs w:val="32"/>
+          <w:u w:val="single"/>
+        </w:rPr>
+        <w:t>globby</w:t>
+      </w:r>
+      <w:proofErr w:type="spellEnd"/>
+      <w:r>
+        <w:rPr>
+          <w:b/>
+          <w:bCs/>
+          <w:color w:val="000000" w:themeColor="text1"/>
+          <w:sz w:val="32"/>
+          <w:szCs w:val="32"/>
+          <w:u w:val="single"/>
+        </w:rPr>
+        <w:t xml:space="preserve"> (selección de archivos por patrones).</w:t>
+      </w:r>
+    </w:p>
+    <w:p>
+      <w:pPr>
+        <w:rPr>
+          <w:b/>
+          <w:bCs/>
+          <w:color w:val="000000" w:themeColor="text1"/>
+          <w:sz w:val="32"/>
+          <w:szCs w:val="32"/>
+        </w:rPr>
+      </w:pPr>
+      <w:r>
+        <w:rPr>
+          <w:b/>
+          <w:bCs/>
+          <w:color w:val="000000" w:themeColor="text1"/>
+          <w:sz w:val="32"/>
+          <w:szCs w:val="32"/>
+          <w:u w:val="single"/>
+        </w:rPr>
+        <w:t>----------------------------------------------------------------------------</w:t>
+      </w:r>
     </w:p>
     <w:p>
       <w:pPr>
@@ -441,30 +1001,198 @@
           <w:szCs w:val="32"/>
           <w:u w:val="single"/>
         </w:rPr>
-        <w:t>- Vector DB local embebida: vectra, @lancedb/lancedb, o hnswlib-node.</w:t>
-      </w:r>
-    </w:p>
-    <w:p>
-      <w:pPr>
-        <w:rPr>
-          <w:b/>
-          <w:bCs/>
-          <w:color w:val="000000" w:themeColor="text1"/>
-          <w:sz w:val="32"/>
-          <w:szCs w:val="32"/>
-          <w:u w:val="single"/>
-        </w:rPr>
-      </w:pPr>
-      <w:r>
-        <w:rPr>
-          <w:b/>
-          <w:bCs/>
-          <w:color w:val="000000" w:themeColor="text1"/>
-          <w:sz w:val="32"/>
-          <w:szCs w:val="32"/>
-          <w:u w:val="single"/>
-        </w:rPr>
-        <w:t>- langchain (@langchain/community + langchain/ollama) para pipeline de carga/split/retrieval.</w:t>
+        <w:t xml:space="preserve">- Vector DB local embebida: </w:t>
+      </w:r>
+      <w:proofErr w:type="spellStart"/>
+      <w:r>
+        <w:rPr>
+          <w:b/>
+          <w:bCs/>
+          <w:color w:val="000000" w:themeColor="text1"/>
+          <w:sz w:val="32"/>
+          <w:szCs w:val="32"/>
+          <w:u w:val="single"/>
+        </w:rPr>
+        <w:t>vectra</w:t>
+      </w:r>
+      <w:proofErr w:type="spellEnd"/>
+      <w:r>
+        <w:rPr>
+          <w:b/>
+          <w:bCs/>
+          <w:color w:val="000000" w:themeColor="text1"/>
+          <w:sz w:val="32"/>
+          <w:szCs w:val="32"/>
+          <w:u w:val="single"/>
+        </w:rPr>
+        <w:t xml:space="preserve">, @lancedb/lancedb, o </w:t>
+      </w:r>
+      <w:proofErr w:type="spellStart"/>
+      <w:r>
+        <w:rPr>
+          <w:b/>
+          <w:bCs/>
+          <w:color w:val="000000" w:themeColor="text1"/>
+          <w:sz w:val="32"/>
+          <w:szCs w:val="32"/>
+          <w:u w:val="single"/>
+        </w:rPr>
+        <w:t>hnswlib-node</w:t>
+      </w:r>
+      <w:proofErr w:type="spellEnd"/>
+      <w:r>
+        <w:rPr>
+          <w:b/>
+          <w:bCs/>
+          <w:color w:val="000000" w:themeColor="text1"/>
+          <w:sz w:val="32"/>
+          <w:szCs w:val="32"/>
+          <w:u w:val="single"/>
+        </w:rPr>
+        <w:t>.</w:t>
+      </w:r>
+    </w:p>
+    <w:p>
+      <w:pPr>
+        <w:rPr>
+          <w:b/>
+          <w:bCs/>
+          <w:color w:val="000000" w:themeColor="text1"/>
+          <w:sz w:val="32"/>
+          <w:szCs w:val="32"/>
+          <w:u w:val="single"/>
+        </w:rPr>
+      </w:pPr>
+      <w:r>
+        <w:rPr>
+          <w:b/>
+          <w:bCs/>
+          <w:color w:val="000000" w:themeColor="text1"/>
+          <w:sz w:val="32"/>
+          <w:szCs w:val="32"/>
+          <w:u w:val="single"/>
+        </w:rPr>
+        <w:t xml:space="preserve">- </w:t>
+      </w:r>
+      <w:proofErr w:type="spellStart"/>
+      <w:r>
+        <w:rPr>
+          <w:b/>
+          <w:bCs/>
+          <w:color w:val="000000" w:themeColor="text1"/>
+          <w:sz w:val="32"/>
+          <w:szCs w:val="32"/>
+          <w:u w:val="single"/>
+        </w:rPr>
+        <w:t>langchain</w:t>
+      </w:r>
+      <w:proofErr w:type="spellEnd"/>
+      <w:r>
+        <w:rPr>
+          <w:b/>
+          <w:bCs/>
+          <w:color w:val="000000" w:themeColor="text1"/>
+          <w:sz w:val="32"/>
+          <w:szCs w:val="32"/>
+          <w:u w:val="single"/>
+        </w:rPr>
+        <w:t xml:space="preserve"> (@langchain/community + </w:t>
+      </w:r>
+      <w:proofErr w:type="spellStart"/>
+      <w:r>
+        <w:rPr>
+          <w:b/>
+          <w:bCs/>
+          <w:color w:val="000000" w:themeColor="text1"/>
+          <w:sz w:val="32"/>
+          <w:szCs w:val="32"/>
+          <w:u w:val="single"/>
+        </w:rPr>
+        <w:t>langchain</w:t>
+      </w:r>
+      <w:proofErr w:type="spellEnd"/>
+      <w:r>
+        <w:rPr>
+          <w:b/>
+          <w:bCs/>
+          <w:color w:val="000000" w:themeColor="text1"/>
+          <w:sz w:val="32"/>
+          <w:szCs w:val="32"/>
+          <w:u w:val="single"/>
+        </w:rPr>
+        <w:t>/</w:t>
+      </w:r>
+      <w:proofErr w:type="spellStart"/>
+      <w:r>
+        <w:rPr>
+          <w:b/>
+          <w:bCs/>
+          <w:color w:val="000000" w:themeColor="text1"/>
+          <w:sz w:val="32"/>
+          <w:szCs w:val="32"/>
+          <w:u w:val="single"/>
+        </w:rPr>
+        <w:t>ollama</w:t>
+      </w:r>
+      <w:proofErr w:type="spellEnd"/>
+      <w:r>
+        <w:rPr>
+          <w:b/>
+          <w:bCs/>
+          <w:color w:val="000000" w:themeColor="text1"/>
+          <w:sz w:val="32"/>
+          <w:szCs w:val="32"/>
+          <w:u w:val="single"/>
+        </w:rPr>
+        <w:t>) para pipeline de carga/</w:t>
+      </w:r>
+      <w:proofErr w:type="spellStart"/>
+      <w:r>
+        <w:rPr>
+          <w:b/>
+          <w:bCs/>
+          <w:color w:val="000000" w:themeColor="text1"/>
+          <w:sz w:val="32"/>
+          <w:szCs w:val="32"/>
+          <w:u w:val="single"/>
+        </w:rPr>
+        <w:t>split</w:t>
+      </w:r>
+      <w:proofErr w:type="spellEnd"/>
+      <w:r>
+        <w:rPr>
+          <w:b/>
+          <w:bCs/>
+          <w:color w:val="000000" w:themeColor="text1"/>
+          <w:sz w:val="32"/>
+          <w:szCs w:val="32"/>
+          <w:u w:val="single"/>
+        </w:rPr>
+        <w:t>/</w:t>
+      </w:r>
+      <w:proofErr w:type="spellStart"/>
+      <w:r>
+        <w:rPr>
+          <w:b/>
+          <w:bCs/>
+          <w:color w:val="000000" w:themeColor="text1"/>
+          <w:sz w:val="32"/>
+          <w:szCs w:val="32"/>
+          <w:u w:val="single"/>
+        </w:rPr>
+        <w:t>retrieval</w:t>
+      </w:r>
+      <w:proofErr w:type="spellEnd"/>
+      <w:r>
+        <w:rPr>
+          <w:b/>
+          <w:bCs/>
+          <w:color w:val="000000" w:themeColor="text1"/>
+          <w:sz w:val="32"/>
+          <w:szCs w:val="32"/>
+          <w:u w:val="single"/>
+        </w:rPr>
+        <w:t>.</w:t>
       </w:r>
     </w:p>
     <w:p>
@@ -490,6 +1218,7 @@
           <w:u w:val="single"/>
         </w:rPr>
       </w:pPr>
+      <w:proofErr w:type="spellStart"/>
       <w:r>
         <w:rPr>
           <w:b/>
@@ -499,92 +1228,10 @@
           <w:szCs w:val="32"/>
           <w:u w:val="single"/>
         </w:rPr>
-        <w:t>Chunking / documentos</w:t>
-      </w:r>
-    </w:p>
-    <w:p>
-      <w:pPr>
-        <w:rPr>
-          <w:b/>
-          <w:bCs/>
-          <w:color w:val="000000" w:themeColor="text1"/>
-          <w:sz w:val="32"/>
-          <w:szCs w:val="32"/>
-          <w:u w:val="single"/>
-        </w:rPr>
-      </w:pPr>
-      <w:r>
-        <w:rPr>
-          <w:b/>
-          <w:bCs/>
-          <w:color w:val="000000" w:themeColor="text1"/>
-          <w:sz w:val="32"/>
-          <w:szCs w:val="32"/>
-          <w:u w:val="single"/>
-        </w:rPr>
-        <w:t>- Splitter de langchain (RecursiveCharacterTextSplitter).</w:t>
-      </w:r>
-    </w:p>
-    <w:p>
-      <w:pPr>
-        <w:rPr>
-          <w:b/>
-          <w:bCs/>
-          <w:color w:val="000000" w:themeColor="text1"/>
-          <w:sz w:val="32"/>
-          <w:szCs w:val="32"/>
-          <w:u w:val="single"/>
-        </w:rPr>
-      </w:pPr>
-      <w:r>
-        <w:rPr>
-          <w:b/>
-          <w:bCs/>
-          <w:color w:val="000000" w:themeColor="text1"/>
-          <w:sz w:val="32"/>
-          <w:szCs w:val="32"/>
-          <w:u w:val="single"/>
-        </w:rPr>
-        <w:t>- tiktoken o gpt-tokenizer (conteo de tokens).</w:t>
-      </w:r>
-    </w:p>
-    <w:p>
-      <w:pPr>
-        <w:rPr>
-          <w:b/>
-          <w:bCs/>
-          <w:color w:val="000000" w:themeColor="text1"/>
-          <w:sz w:val="32"/>
-          <w:szCs w:val="32"/>
-          <w:u w:val="single"/>
-        </w:rPr>
-      </w:pPr>
-      <w:r>
-        <w:rPr>
-          <w:b/>
-          <w:bCs/>
-          <w:color w:val="000000" w:themeColor="text1"/>
-          <w:sz w:val="32"/>
-          <w:szCs w:val="32"/>
-          <w:u w:val="single"/>
-        </w:rPr>
-        <w:t>- gray-matter (frontmatter/contexto).</w:t>
-      </w:r>
-    </w:p>
-    <w:p>
-      <w:pPr>
-        <w:rPr>
-          <w:b/>
-          <w:bCs/>
-          <w:color w:val="000000" w:themeColor="text1"/>
-          <w:sz w:val="32"/>
-          <w:szCs w:val="32"/>
-          <w:u w:val="single"/>
-        </w:rPr>
-      </w:pPr>
-    </w:p>
-    <w:p>
-      <w:pPr>
+        <w:t>Chunking</w:t>
+      </w:r>
+      <w:proofErr w:type="spellEnd"/>
+      <w:r>
         <w:rPr>
           <w:b/>
           <w:bCs/>
@@ -593,8 +1240,260 @@
           <w:szCs w:val="32"/>
           <w:u w:val="single"/>
         </w:rPr>
-      </w:pPr>
-      <w:r>
+        <w:t xml:space="preserve"> / documentos</w:t>
+      </w:r>
+    </w:p>
+    <w:p>
+      <w:pPr>
+        <w:rPr>
+          <w:b/>
+          <w:bCs/>
+          <w:color w:val="000000" w:themeColor="text1"/>
+          <w:sz w:val="32"/>
+          <w:szCs w:val="32"/>
+          <w:u w:val="single"/>
+        </w:rPr>
+      </w:pPr>
+      <w:r>
+        <w:rPr>
+          <w:b/>
+          <w:bCs/>
+          <w:color w:val="000000" w:themeColor="text1"/>
+          <w:sz w:val="32"/>
+          <w:szCs w:val="32"/>
+          <w:u w:val="single"/>
+        </w:rPr>
+        <w:t xml:space="preserve">- </w:t>
+      </w:r>
+      <w:proofErr w:type="spellStart"/>
+      <w:r>
+        <w:rPr>
+          <w:b/>
+          <w:bCs/>
+          <w:color w:val="000000" w:themeColor="text1"/>
+          <w:sz w:val="32"/>
+          <w:szCs w:val="32"/>
+          <w:u w:val="single"/>
+        </w:rPr>
+        <w:t>Splitter</w:t>
+      </w:r>
+      <w:proofErr w:type="spellEnd"/>
+      <w:r>
+        <w:rPr>
+          <w:b/>
+          <w:bCs/>
+          <w:color w:val="000000" w:themeColor="text1"/>
+          <w:sz w:val="32"/>
+          <w:szCs w:val="32"/>
+          <w:u w:val="single"/>
+        </w:rPr>
+        <w:t xml:space="preserve"> de </w:t>
+      </w:r>
+      <w:proofErr w:type="spellStart"/>
+      <w:r>
+        <w:rPr>
+          <w:b/>
+          <w:bCs/>
+          <w:color w:val="000000" w:themeColor="text1"/>
+          <w:sz w:val="32"/>
+          <w:szCs w:val="32"/>
+          <w:u w:val="single"/>
+        </w:rPr>
+        <w:t>langchain</w:t>
+      </w:r>
+      <w:proofErr w:type="spellEnd"/>
+      <w:r>
+        <w:rPr>
+          <w:b/>
+          <w:bCs/>
+          <w:color w:val="000000" w:themeColor="text1"/>
+          <w:sz w:val="32"/>
+          <w:szCs w:val="32"/>
+          <w:u w:val="single"/>
+        </w:rPr>
+        <w:t xml:space="preserve"> (</w:t>
+      </w:r>
+      <w:proofErr w:type="spellStart"/>
+      <w:r>
+        <w:rPr>
+          <w:b/>
+          <w:bCs/>
+          <w:color w:val="000000" w:themeColor="text1"/>
+          <w:sz w:val="32"/>
+          <w:szCs w:val="32"/>
+          <w:u w:val="single"/>
+        </w:rPr>
+        <w:t>RecursiveCharacterTextSplitter</w:t>
+      </w:r>
+      <w:proofErr w:type="spellEnd"/>
+      <w:r>
+        <w:rPr>
+          <w:b/>
+          <w:bCs/>
+          <w:color w:val="000000" w:themeColor="text1"/>
+          <w:sz w:val="32"/>
+          <w:szCs w:val="32"/>
+          <w:u w:val="single"/>
+        </w:rPr>
+        <w:t>).</w:t>
+      </w:r>
+    </w:p>
+    <w:p>
+      <w:pPr>
+        <w:rPr>
+          <w:b/>
+          <w:bCs/>
+          <w:color w:val="000000" w:themeColor="text1"/>
+          <w:sz w:val="32"/>
+          <w:szCs w:val="32"/>
+          <w:u w:val="single"/>
+        </w:rPr>
+      </w:pPr>
+      <w:r>
+        <w:rPr>
+          <w:b/>
+          <w:bCs/>
+          <w:color w:val="000000" w:themeColor="text1"/>
+          <w:sz w:val="32"/>
+          <w:szCs w:val="32"/>
+          <w:u w:val="single"/>
+        </w:rPr>
+        <w:t xml:space="preserve">- </w:t>
+      </w:r>
+      <w:proofErr w:type="spellStart"/>
+      <w:r>
+        <w:rPr>
+          <w:b/>
+          <w:bCs/>
+          <w:color w:val="000000" w:themeColor="text1"/>
+          <w:sz w:val="32"/>
+          <w:szCs w:val="32"/>
+          <w:u w:val="single"/>
+        </w:rPr>
+        <w:t>tiktoken</w:t>
+      </w:r>
+      <w:proofErr w:type="spellEnd"/>
+      <w:r>
+        <w:rPr>
+          <w:b/>
+          <w:bCs/>
+          <w:color w:val="000000" w:themeColor="text1"/>
+          <w:sz w:val="32"/>
+          <w:szCs w:val="32"/>
+          <w:u w:val="single"/>
+        </w:rPr>
+        <w:t xml:space="preserve"> o </w:t>
+      </w:r>
+      <w:proofErr w:type="spellStart"/>
+      <w:r>
+        <w:rPr>
+          <w:b/>
+          <w:bCs/>
+          <w:color w:val="000000" w:themeColor="text1"/>
+          <w:sz w:val="32"/>
+          <w:szCs w:val="32"/>
+          <w:u w:val="single"/>
+        </w:rPr>
+        <w:t>gpt-tokenizer</w:t>
+      </w:r>
+      <w:proofErr w:type="spellEnd"/>
+      <w:r>
+        <w:rPr>
+          <w:b/>
+          <w:bCs/>
+          <w:color w:val="000000" w:themeColor="text1"/>
+          <w:sz w:val="32"/>
+          <w:szCs w:val="32"/>
+          <w:u w:val="single"/>
+        </w:rPr>
+        <w:t xml:space="preserve"> (conteo de tokens).</w:t>
+      </w:r>
+    </w:p>
+    <w:p>
+      <w:pPr>
+        <w:rPr>
+          <w:b/>
+          <w:bCs/>
+          <w:color w:val="000000" w:themeColor="text1"/>
+          <w:sz w:val="32"/>
+          <w:szCs w:val="32"/>
+          <w:u w:val="single"/>
+        </w:rPr>
+      </w:pPr>
+      <w:r>
+        <w:rPr>
+          <w:b/>
+          <w:bCs/>
+          <w:color w:val="000000" w:themeColor="text1"/>
+          <w:sz w:val="32"/>
+          <w:szCs w:val="32"/>
+          <w:u w:val="single"/>
+        </w:rPr>
+        <w:t>- gray-</w:t>
+      </w:r>
+      <w:proofErr w:type="spellStart"/>
+      <w:r>
+        <w:rPr>
+          <w:b/>
+          <w:bCs/>
+          <w:color w:val="000000" w:themeColor="text1"/>
+          <w:sz w:val="32"/>
+          <w:szCs w:val="32"/>
+          <w:u w:val="single"/>
+        </w:rPr>
+        <w:t>matter</w:t>
+      </w:r>
+      <w:proofErr w:type="spellEnd"/>
+      <w:r>
+        <w:rPr>
+          <w:b/>
+          <w:bCs/>
+          <w:color w:val="000000" w:themeColor="text1"/>
+          <w:sz w:val="32"/>
+          <w:szCs w:val="32"/>
+          <w:u w:val="single"/>
+        </w:rPr>
+        <w:t xml:space="preserve"> (</w:t>
+      </w:r>
+      <w:proofErr w:type="spellStart"/>
+      <w:r>
+        <w:rPr>
+          <w:b/>
+          <w:bCs/>
+          <w:color w:val="000000" w:themeColor="text1"/>
+          <w:sz w:val="32"/>
+          <w:szCs w:val="32"/>
+          <w:u w:val="single"/>
+        </w:rPr>
+        <w:t>frontmatter</w:t>
+      </w:r>
+      <w:proofErr w:type="spellEnd"/>
+      <w:r>
+        <w:rPr>
+          <w:b/>
+          <w:bCs/>
+          <w:color w:val="000000" w:themeColor="text1"/>
+          <w:sz w:val="32"/>
+          <w:szCs w:val="32"/>
+          <w:u w:val="single"/>
+        </w:rPr>
+        <w:t>/contexto).</w:t>
+      </w:r>
+    </w:p>
+    <w:p>
+      <w:pPr>
+        <w:rPr>
+          <w:b/>
+          <w:bCs/>
+          <w:color w:val="000000" w:themeColor="text1"/>
+          <w:sz w:val="32"/>
+          <w:szCs w:val="32"/>
+          <w:u w:val="single"/>
+        </w:rPr>
+      </w:pPr>
+    </w:p>
+    <w:p>
+      <w:pPr>
         <w:rPr>
           <w:b/>
           <w:bCs/>
@@ -603,6 +1502,16 @@
           <w:szCs w:val="32"/>
           <w:u w:val="single"/>
         </w:rPr>
+      </w:pPr>
+      <w:r>
+        <w:rPr>
+          <w:b/>
+          <w:bCs/>
+          <w:color w:val="FF0000"/>
+          <w:sz w:val="32"/>
+          <w:szCs w:val="32"/>
+          <w:u w:val="single"/>
+        </w:rPr>
         <w:t>Generación de documentación</w:t>
       </w:r>
     </w:p>
@@ -626,30 +1535,150 @@
           <w:szCs w:val="32"/>
           <w:u w:val="single"/>
         </w:rPr>
-        <w:t>- Plantillas: handlebars o ejs.</w:t>
-      </w:r>
-    </w:p>
-    <w:p>
-      <w:pPr>
-        <w:rPr>
-          <w:b/>
-          <w:bCs/>
-          <w:color w:val="000000" w:themeColor="text1"/>
-          <w:sz w:val="32"/>
-          <w:szCs w:val="32"/>
-          <w:u w:val="single"/>
-        </w:rPr>
-      </w:pPr>
-      <w:r>
-        <w:rPr>
-          <w:b/>
-          <w:bCs/>
-          <w:color w:val="000000" w:themeColor="text1"/>
-          <w:sz w:val="32"/>
-          <w:szCs w:val="32"/>
-          <w:u w:val="single"/>
-        </w:rPr>
-        <w:t>- marked / markdown-it (render de docs).</w:t>
+        <w:t xml:space="preserve">- Plantillas: </w:t>
+      </w:r>
+      <w:proofErr w:type="spellStart"/>
+      <w:r>
+        <w:rPr>
+          <w:b/>
+          <w:bCs/>
+          <w:color w:val="000000" w:themeColor="text1"/>
+          <w:sz w:val="32"/>
+          <w:szCs w:val="32"/>
+          <w:u w:val="single"/>
+        </w:rPr>
+        <w:t>handlebars</w:t>
+      </w:r>
+      <w:proofErr w:type="spellEnd"/>
+      <w:r>
+        <w:rPr>
+          <w:b/>
+          <w:bCs/>
+          <w:color w:val="000000" w:themeColor="text1"/>
+          <w:sz w:val="32"/>
+          <w:szCs w:val="32"/>
+          <w:u w:val="single"/>
+        </w:rPr>
+        <w:t xml:space="preserve"> o </w:t>
+      </w:r>
+      <w:proofErr w:type="spellStart"/>
+      <w:r>
+        <w:rPr>
+          <w:b/>
+          <w:bCs/>
+          <w:color w:val="000000" w:themeColor="text1"/>
+          <w:sz w:val="32"/>
+          <w:szCs w:val="32"/>
+          <w:u w:val="single"/>
+        </w:rPr>
+        <w:t>ejs</w:t>
+      </w:r>
+      <w:proofErr w:type="spellEnd"/>
+      <w:r>
+        <w:rPr>
+          <w:b/>
+          <w:bCs/>
+          <w:color w:val="000000" w:themeColor="text1"/>
+          <w:sz w:val="32"/>
+          <w:szCs w:val="32"/>
+          <w:u w:val="single"/>
+        </w:rPr>
+        <w:t>.</w:t>
+      </w:r>
+    </w:p>
+    <w:p>
+      <w:pPr>
+        <w:rPr>
+          <w:b/>
+          <w:bCs/>
+          <w:color w:val="000000" w:themeColor="text1"/>
+          <w:sz w:val="32"/>
+          <w:szCs w:val="32"/>
+          <w:u w:val="single"/>
+        </w:rPr>
+      </w:pPr>
+      <w:r>
+        <w:rPr>
+          <w:b/>
+          <w:bCs/>
+          <w:color w:val="000000" w:themeColor="text1"/>
+          <w:sz w:val="32"/>
+          <w:szCs w:val="32"/>
+          <w:u w:val="single"/>
+        </w:rPr>
+        <w:t xml:space="preserve">- </w:t>
+      </w:r>
+      <w:proofErr w:type="spellStart"/>
+      <w:r>
+        <w:rPr>
+          <w:b/>
+          <w:bCs/>
+          <w:color w:val="000000" w:themeColor="text1"/>
+          <w:sz w:val="32"/>
+          <w:szCs w:val="32"/>
+          <w:u w:val="single"/>
+        </w:rPr>
+        <w:t>marked</w:t>
+      </w:r>
+      <w:proofErr w:type="spellEnd"/>
+      <w:r>
+        <w:rPr>
+          <w:b/>
+          <w:bCs/>
+          <w:color w:val="000000" w:themeColor="text1"/>
+          <w:sz w:val="32"/>
+          <w:szCs w:val="32"/>
+          <w:u w:val="single"/>
+        </w:rPr>
+        <w:t xml:space="preserve"> / </w:t>
+      </w:r>
+      <w:proofErr w:type="spellStart"/>
+      <w:r>
+        <w:rPr>
+          <w:b/>
+          <w:bCs/>
+          <w:color w:val="000000" w:themeColor="text1"/>
+          <w:sz w:val="32"/>
+          <w:szCs w:val="32"/>
+          <w:u w:val="single"/>
+        </w:rPr>
+        <w:t>markdown-it</w:t>
+      </w:r>
+      <w:proofErr w:type="spellEnd"/>
+      <w:r>
+        <w:rPr>
+          <w:b/>
+          <w:bCs/>
+          <w:color w:val="000000" w:themeColor="text1"/>
+          <w:sz w:val="32"/>
+          <w:szCs w:val="32"/>
+          <w:u w:val="single"/>
+        </w:rPr>
+        <w:t xml:space="preserve"> (render de </w:t>
+      </w:r>
+      <w:proofErr w:type="spellStart"/>
+      <w:r>
+        <w:rPr>
+          <w:b/>
+          <w:bCs/>
+          <w:color w:val="000000" w:themeColor="text1"/>
+          <w:sz w:val="32"/>
+          <w:szCs w:val="32"/>
+          <w:u w:val="single"/>
+        </w:rPr>
+        <w:t>docs</w:t>
+      </w:r>
+      <w:proofErr w:type="spellEnd"/>
+      <w:r>
+        <w:rPr>
+          <w:b/>
+          <w:bCs/>
+          <w:color w:val="000000" w:themeColor="text1"/>
+          <w:sz w:val="32"/>
+          <w:szCs w:val="32"/>
+          <w:u w:val="single"/>
+        </w:rPr>
+        <w:t>).</w:t>
       </w:r>
     </w:p>
     <w:p>
@@ -707,7 +1736,55 @@
           <w:szCs w:val="32"/>
           <w:u w:val="single"/>
         </w:rPr>
-        <w:t>- Hash de archivos: crypto (nativo) o xxhash-wasm.</w:t>
+        <w:t xml:space="preserve">- Hash de archivos: </w:t>
+      </w:r>
+      <w:proofErr w:type="spellStart"/>
+      <w:r>
+        <w:rPr>
+          <w:b/>
+          <w:bCs/>
+          <w:color w:val="000000" w:themeColor="text1"/>
+          <w:sz w:val="32"/>
+          <w:szCs w:val="32"/>
+          <w:u w:val="single"/>
+        </w:rPr>
+        <w:t>crypto</w:t>
+      </w:r>
+      <w:proofErr w:type="spellEnd"/>
+      <w:r>
+        <w:rPr>
+          <w:b/>
+          <w:bCs/>
+          <w:color w:val="000000" w:themeColor="text1"/>
+          <w:sz w:val="32"/>
+          <w:szCs w:val="32"/>
+          <w:u w:val="single"/>
+        </w:rPr>
+        <w:t xml:space="preserve"> (nativo) o </w:t>
+      </w:r>
+      <w:proofErr w:type="spellStart"/>
+      <w:r>
+        <w:rPr>
+          <w:b/>
+          <w:bCs/>
+          <w:color w:val="000000" w:themeColor="text1"/>
+          <w:sz w:val="32"/>
+          <w:szCs w:val="32"/>
+          <w:u w:val="single"/>
+        </w:rPr>
+        <w:t>xxhash-wasm</w:t>
+      </w:r>
+      <w:proofErr w:type="spellEnd"/>
+      <w:r>
+        <w:rPr>
+          <w:b/>
+          <w:bCs/>
+          <w:color w:val="000000" w:themeColor="text1"/>
+          <w:sz w:val="32"/>
+          <w:szCs w:val="32"/>
+          <w:u w:val="single"/>
+        </w:rPr>
+        <w:t>.</w:t>
       </w:r>
     </w:p>
     <w:p>
@@ -731,7 +1808,55 @@
           <w:u w:val="single"/>
         </w:rPr>
         <w:lastRenderedPageBreak/>
-        <w:t>- Persistencia de estado: lowdb, better-sqlite3 o .json cache.</w:t>
+        <w:t xml:space="preserve">- Persistencia de estado: </w:t>
+      </w:r>
+      <w:proofErr w:type="spellStart"/>
+      <w:r>
+        <w:rPr>
+          <w:b/>
+          <w:bCs/>
+          <w:color w:val="000000" w:themeColor="text1"/>
+          <w:sz w:val="32"/>
+          <w:szCs w:val="32"/>
+          <w:u w:val="single"/>
+        </w:rPr>
+        <w:t>lowdb</w:t>
+      </w:r>
+      <w:proofErr w:type="spellEnd"/>
+      <w:r>
+        <w:rPr>
+          <w:b/>
+          <w:bCs/>
+          <w:color w:val="000000" w:themeColor="text1"/>
+          <w:sz w:val="32"/>
+          <w:szCs w:val="32"/>
+          <w:u w:val="single"/>
+        </w:rPr>
+        <w:t>, better-sqlite3 o .</w:t>
+      </w:r>
+      <w:proofErr w:type="spellStart"/>
+      <w:r>
+        <w:rPr>
+          <w:b/>
+          <w:bCs/>
+          <w:color w:val="000000" w:themeColor="text1"/>
+          <w:sz w:val="32"/>
+          <w:szCs w:val="32"/>
+          <w:u w:val="single"/>
+        </w:rPr>
+        <w:t>json</w:t>
+      </w:r>
+      <w:proofErr w:type="spellEnd"/>
+      <w:r>
+        <w:rPr>
+          <w:b/>
+          <w:bCs/>
+          <w:color w:val="000000" w:themeColor="text1"/>
+          <w:sz w:val="32"/>
+          <w:szCs w:val="32"/>
+          <w:u w:val="single"/>
+        </w:rPr>
+        <w:t xml:space="preserve"> cache.</w:t>
       </w:r>
     </w:p>
     <w:p>
@@ -789,53 +1914,173 @@
           <w:szCs w:val="32"/>
           <w:u w:val="single"/>
         </w:rPr>
-        <w:t>- commander o yargs (comandos).</w:t>
-      </w:r>
-    </w:p>
-    <w:p>
-      <w:pPr>
-        <w:rPr>
-          <w:b/>
-          <w:bCs/>
-          <w:color w:val="000000" w:themeColor="text1"/>
-          <w:sz w:val="32"/>
-          <w:szCs w:val="32"/>
-          <w:u w:val="single"/>
-        </w:rPr>
-      </w:pPr>
-      <w:r>
-        <w:rPr>
-          <w:b/>
-          <w:bCs/>
-          <w:color w:val="000000" w:themeColor="text1"/>
-          <w:sz w:val="32"/>
-          <w:szCs w:val="32"/>
-          <w:u w:val="single"/>
-        </w:rPr>
-        <w:t>- ora + chalk (ya tienes chalk; añade ora para progreso).</w:t>
-      </w:r>
-    </w:p>
-    <w:p>
-      <w:pPr>
-        <w:rPr>
-          <w:b/>
-          <w:bCs/>
-          <w:color w:val="000000" w:themeColor="text1"/>
-          <w:sz w:val="32"/>
-          <w:szCs w:val="32"/>
-          <w:u w:val="single"/>
-        </w:rPr>
-      </w:pPr>
-      <w:r>
-        <w:rPr>
-          <w:b/>
-          <w:bCs/>
-          <w:color w:val="000000" w:themeColor="text1"/>
-          <w:sz w:val="32"/>
-          <w:szCs w:val="32"/>
-          <w:u w:val="single"/>
-        </w:rPr>
-        <w:t>- p-queue (limitar concurrencia).</w:t>
+        <w:t xml:space="preserve">- </w:t>
+      </w:r>
+      <w:proofErr w:type="spellStart"/>
+      <w:r>
+        <w:rPr>
+          <w:b/>
+          <w:bCs/>
+          <w:color w:val="000000" w:themeColor="text1"/>
+          <w:sz w:val="32"/>
+          <w:szCs w:val="32"/>
+          <w:u w:val="single"/>
+        </w:rPr>
+        <w:t>commander</w:t>
+      </w:r>
+      <w:proofErr w:type="spellEnd"/>
+      <w:r>
+        <w:rPr>
+          <w:b/>
+          <w:bCs/>
+          <w:color w:val="000000" w:themeColor="text1"/>
+          <w:sz w:val="32"/>
+          <w:szCs w:val="32"/>
+          <w:u w:val="single"/>
+        </w:rPr>
+        <w:t xml:space="preserve"> o </w:t>
+      </w:r>
+      <w:proofErr w:type="spellStart"/>
+      <w:r>
+        <w:rPr>
+          <w:b/>
+          <w:bCs/>
+          <w:color w:val="000000" w:themeColor="text1"/>
+          <w:sz w:val="32"/>
+          <w:szCs w:val="32"/>
+          <w:u w:val="single"/>
+        </w:rPr>
+        <w:t>yargs</w:t>
+      </w:r>
+      <w:proofErr w:type="spellEnd"/>
+      <w:r>
+        <w:rPr>
+          <w:b/>
+          <w:bCs/>
+          <w:color w:val="000000" w:themeColor="text1"/>
+          <w:sz w:val="32"/>
+          <w:szCs w:val="32"/>
+          <w:u w:val="single"/>
+        </w:rPr>
+        <w:t xml:space="preserve"> (comandos).</w:t>
+      </w:r>
+    </w:p>
+    <w:p>
+      <w:pPr>
+        <w:rPr>
+          <w:b/>
+          <w:bCs/>
+          <w:color w:val="000000" w:themeColor="text1"/>
+          <w:sz w:val="32"/>
+          <w:szCs w:val="32"/>
+          <w:u w:val="single"/>
+        </w:rPr>
+      </w:pPr>
+      <w:r>
+        <w:rPr>
+          <w:b/>
+          <w:bCs/>
+          <w:color w:val="000000" w:themeColor="text1"/>
+          <w:sz w:val="32"/>
+          <w:szCs w:val="32"/>
+          <w:u w:val="single"/>
+        </w:rPr>
+        <w:t xml:space="preserve">- ora + </w:t>
+      </w:r>
+      <w:proofErr w:type="spellStart"/>
+      <w:r>
+        <w:rPr>
+          <w:b/>
+          <w:bCs/>
+          <w:color w:val="000000" w:themeColor="text1"/>
+          <w:sz w:val="32"/>
+          <w:szCs w:val="32"/>
+          <w:u w:val="single"/>
+        </w:rPr>
+        <w:t>chalk</w:t>
+      </w:r>
+      <w:proofErr w:type="spellEnd"/>
+      <w:r>
+        <w:rPr>
+          <w:b/>
+          <w:bCs/>
+          <w:color w:val="000000" w:themeColor="text1"/>
+          <w:sz w:val="32"/>
+          <w:szCs w:val="32"/>
+          <w:u w:val="single"/>
+        </w:rPr>
+        <w:t xml:space="preserve"> (ya tienes </w:t>
+      </w:r>
+      <w:proofErr w:type="spellStart"/>
+      <w:r>
+        <w:rPr>
+          <w:b/>
+          <w:bCs/>
+          <w:color w:val="000000" w:themeColor="text1"/>
+          <w:sz w:val="32"/>
+          <w:szCs w:val="32"/>
+          <w:u w:val="single"/>
+        </w:rPr>
+        <w:t>chalk</w:t>
+      </w:r>
+      <w:proofErr w:type="spellEnd"/>
+      <w:r>
+        <w:rPr>
+          <w:b/>
+          <w:bCs/>
+          <w:color w:val="000000" w:themeColor="text1"/>
+          <w:sz w:val="32"/>
+          <w:szCs w:val="32"/>
+          <w:u w:val="single"/>
+        </w:rPr>
+        <w:t>; añade ora para progreso).</w:t>
+      </w:r>
+    </w:p>
+    <w:p>
+      <w:pPr>
+        <w:rPr>
+          <w:b/>
+          <w:bCs/>
+          <w:color w:val="000000" w:themeColor="text1"/>
+          <w:sz w:val="32"/>
+          <w:szCs w:val="32"/>
+          <w:u w:val="single"/>
+        </w:rPr>
+      </w:pPr>
+      <w:r>
+        <w:rPr>
+          <w:b/>
+          <w:bCs/>
+          <w:color w:val="000000" w:themeColor="text1"/>
+          <w:sz w:val="32"/>
+          <w:szCs w:val="32"/>
+          <w:u w:val="single"/>
+        </w:rPr>
+        <w:t>- p-</w:t>
+      </w:r>
+      <w:proofErr w:type="spellStart"/>
+      <w:r>
+        <w:rPr>
+          <w:b/>
+          <w:bCs/>
+          <w:color w:val="000000" w:themeColor="text1"/>
+          <w:sz w:val="32"/>
+          <w:szCs w:val="32"/>
+          <w:u w:val="single"/>
+        </w:rPr>
+        <w:t>queue</w:t>
+      </w:r>
+      <w:proofErr w:type="spellEnd"/>
+      <w:r>
+        <w:rPr>
+          <w:b/>
+          <w:bCs/>
+          <w:color w:val="000000" w:themeColor="text1"/>
+          <w:sz w:val="32"/>
+          <w:szCs w:val="32"/>
+          <w:u w:val="single"/>
+        </w:rPr>
+        <w:t xml:space="preserve"> (limitar concurrencia).</w:t>
       </w:r>
     </w:p>
     <w:p>
@@ -891,64 +2136,184 @@
           <w:szCs w:val="32"/>
           <w:u w:val="single"/>
         </w:rPr>
-        <w:t>- universal-ctags (índice de símbolos).</w:t>
-      </w:r>
-    </w:p>
-    <w:p>
-      <w:pPr>
-        <w:rPr>
-          <w:b/>
-          <w:bCs/>
-          <w:color w:val="000000" w:themeColor="text1"/>
-          <w:sz w:val="32"/>
-          <w:szCs w:val="32"/>
-          <w:u w:val="single"/>
-        </w:rPr>
-      </w:pPr>
-      <w:r>
-        <w:rPr>
-          <w:b/>
-          <w:bCs/>
-          <w:color w:val="000000" w:themeColor="text1"/>
-          <w:sz w:val="32"/>
-          <w:szCs w:val="32"/>
-          <w:u w:val="single"/>
-        </w:rPr>
-        <w:t>- typedoc / jsdoc (docs JS/TS).</w:t>
-      </w:r>
-    </w:p>
-    <w:p>
-      <w:pPr>
-        <w:rPr>
-          <w:b/>
-          <w:bCs/>
-          <w:color w:val="000000" w:themeColor="text1"/>
-          <w:sz w:val="32"/>
-          <w:szCs w:val="32"/>
-          <w:u w:val="single"/>
-        </w:rPr>
-      </w:pPr>
-    </w:p>
-    <w:p>
-      <w:pPr>
-        <w:rPr>
-          <w:b/>
-          <w:bCs/>
-          <w:color w:val="000000" w:themeColor="text1"/>
-          <w:sz w:val="32"/>
-          <w:szCs w:val="32"/>
-        </w:rPr>
-      </w:pPr>
-      <w:r>
-        <w:rPr>
-          <w:b/>
-          <w:bCs/>
-          <w:color w:val="000000" w:themeColor="text1"/>
-          <w:sz w:val="32"/>
-          <w:szCs w:val="32"/>
-          <w:u w:val="single"/>
-        </w:rPr>
-        <w:t>Continue  opencode -s ses_ed3d57ed3ffeU263nPa56eghRX</w:t>
+        <w:t>- universal-</w:t>
+      </w:r>
+      <w:proofErr w:type="spellStart"/>
+      <w:r>
+        <w:rPr>
+          <w:b/>
+          <w:bCs/>
+          <w:color w:val="000000" w:themeColor="text1"/>
+          <w:sz w:val="32"/>
+          <w:szCs w:val="32"/>
+          <w:u w:val="single"/>
+        </w:rPr>
+        <w:t>ctags</w:t>
+      </w:r>
+      <w:proofErr w:type="spellEnd"/>
+      <w:r>
+        <w:rPr>
+          <w:b/>
+          <w:bCs/>
+          <w:color w:val="000000" w:themeColor="text1"/>
+          <w:sz w:val="32"/>
+          <w:szCs w:val="32"/>
+          <w:u w:val="single"/>
+        </w:rPr>
+        <w:t xml:space="preserve"> (índice de símbolos).</w:t>
+      </w:r>
+    </w:p>
+    <w:p>
+      <w:pPr>
+        <w:rPr>
+          <w:b/>
+          <w:bCs/>
+          <w:color w:val="000000" w:themeColor="text1"/>
+          <w:sz w:val="32"/>
+          <w:szCs w:val="32"/>
+          <w:u w:val="single"/>
+        </w:rPr>
+      </w:pPr>
+      <w:r>
+        <w:rPr>
+          <w:b/>
+          <w:bCs/>
+          <w:color w:val="000000" w:themeColor="text1"/>
+          <w:sz w:val="32"/>
+          <w:szCs w:val="32"/>
+          <w:u w:val="single"/>
+        </w:rPr>
+        <w:t xml:space="preserve">- </w:t>
+      </w:r>
+      <w:proofErr w:type="spellStart"/>
+      <w:r>
+        <w:rPr>
+          <w:b/>
+          <w:bCs/>
+          <w:color w:val="000000" w:themeColor="text1"/>
+          <w:sz w:val="32"/>
+          <w:szCs w:val="32"/>
+          <w:u w:val="single"/>
+        </w:rPr>
+        <w:t>typedoc</w:t>
+      </w:r>
+      <w:proofErr w:type="spellEnd"/>
+      <w:r>
+        <w:rPr>
+          <w:b/>
+          <w:bCs/>
+          <w:color w:val="000000" w:themeColor="text1"/>
+          <w:sz w:val="32"/>
+          <w:szCs w:val="32"/>
+          <w:u w:val="single"/>
+        </w:rPr>
+        <w:t xml:space="preserve"> / </w:t>
+      </w:r>
+      <w:proofErr w:type="spellStart"/>
+      <w:r>
+        <w:rPr>
+          <w:b/>
+          <w:bCs/>
+          <w:color w:val="000000" w:themeColor="text1"/>
+          <w:sz w:val="32"/>
+          <w:szCs w:val="32"/>
+          <w:u w:val="single"/>
+        </w:rPr>
+        <w:t>jsdoc</w:t>
+      </w:r>
+      <w:proofErr w:type="spellEnd"/>
+      <w:r>
+        <w:rPr>
+          <w:b/>
+          <w:bCs/>
+          <w:color w:val="000000" w:themeColor="text1"/>
+          <w:sz w:val="32"/>
+          <w:szCs w:val="32"/>
+          <w:u w:val="single"/>
+        </w:rPr>
+        <w:t xml:space="preserve"> (</w:t>
+      </w:r>
+      <w:proofErr w:type="spellStart"/>
+      <w:r>
+        <w:rPr>
+          <w:b/>
+          <w:bCs/>
+          <w:color w:val="000000" w:themeColor="text1"/>
+          <w:sz w:val="32"/>
+          <w:szCs w:val="32"/>
+          <w:u w:val="single"/>
+        </w:rPr>
+        <w:t>docs</w:t>
+      </w:r>
+      <w:proofErr w:type="spellEnd"/>
+      <w:r>
+        <w:rPr>
+          <w:b/>
+          <w:bCs/>
+          <w:color w:val="000000" w:themeColor="text1"/>
+          <w:sz w:val="32"/>
+          <w:szCs w:val="32"/>
+          <w:u w:val="single"/>
+        </w:rPr>
+        <w:t xml:space="preserve"> JS/TS).</w:t>
+      </w:r>
+    </w:p>
+    <w:p>
+      <w:pPr>
+        <w:rPr>
+          <w:b/>
+          <w:bCs/>
+          <w:color w:val="000000" w:themeColor="text1"/>
+          <w:sz w:val="32"/>
+          <w:szCs w:val="32"/>
+          <w:u w:val="single"/>
+        </w:rPr>
+      </w:pPr>
+    </w:p>
+    <w:p>
+      <w:pPr>
+        <w:rPr>
+          <w:b/>
+          <w:bCs/>
+          <w:color w:val="000000" w:themeColor="text1"/>
+          <w:sz w:val="32"/>
+          <w:szCs w:val="32"/>
+        </w:rPr>
+      </w:pPr>
+      <w:r>
+        <w:rPr>
+          <w:b/>
+          <w:bCs/>
+          <w:color w:val="000000" w:themeColor="text1"/>
+          <w:sz w:val="32"/>
+          <w:szCs w:val="32"/>
+          <w:u w:val="single"/>
+        </w:rPr>
+        <w:t xml:space="preserve">Continue  </w:t>
+      </w:r>
+      <w:proofErr w:type="spellStart"/>
+      <w:r>
+        <w:rPr>
+          <w:b/>
+          <w:bCs/>
+          <w:color w:val="000000" w:themeColor="text1"/>
+          <w:sz w:val="32"/>
+          <w:szCs w:val="32"/>
+          <w:u w:val="single"/>
+        </w:rPr>
+        <w:t>opencode</w:t>
+      </w:r>
+      <w:proofErr w:type="spellEnd"/>
+      <w:r>
+        <w:rPr>
+          <w:b/>
+          <w:bCs/>
+          <w:color w:val="000000" w:themeColor="text1"/>
+          <w:sz w:val="32"/>
+          <w:szCs w:val="32"/>
+          <w:u w:val="single"/>
+        </w:rPr>
+        <w:t xml:space="preserve"> -s ses_ed3d57ed3ffeU263nPa56eghRX</w:t>
       </w:r>
     </w:p>
     <w:sectPr>

</xml_diff>